<commit_message>
Final fix: eighteen weeks -> nineteen weeks in logbook Week 18 and Week 19 reflections - all four documents now fully consistent and ready
</commit_message>
<xml_diff>
--- a/thesis/final/Logbook.docx
+++ b/thesis/final/Logbook.docx
@@ -1632,7 +1632,7 @@
         <w:t xml:space="preserve"> </w:t>
       </w:r>
       <w:r>
-        <w:t xml:space="preserve">The internship is effectively in its closing phase. The main body of technical and written work is complete; what remains is the Galchin meeting, the final portfolio update, and preparation for the July defense. Looking back across the eighteen weeks, the most significant development was not technical but methodological: learning to treat expert feedback as a diagnostic signal rather than a criticism to manage, and building the habit of documenting decisions at the time they are made rather than reconstructing them after the fact.</w:t>
+        <w:t xml:space="preserve">The internship is effectively in its closing phase. The main body of technical and written work is complete; what remains is the Galchin meeting, the final portfolio update, and preparation for the July defense. Looking back across the nineteen weeks, the most significant development was not technical but methodological: learning to treat expert feedback as a diagnostic signal rather than a criticism to manage, and building the habit of documenting decisions at the time they are made rather than reconstructing them after the fact.</w:t>
       </w:r>
     </w:p>
     <w:bookmarkEnd w:id="33"/>
@@ -1696,7 +1696,7 @@
         <w:t xml:space="preserve"> </w:t>
       </w:r>
       <w:r>
-        <w:t xml:space="preserve">The project is now fully in its closing phase. All experimental work, writing, and document revisions are complete. The Galchin handover confirmed that the communication objective for the internship was met - a non-technical stakeholder found the tool genuinely useful without requiring a technical explanation. The remaining focus is defence preparation: ensuring every methodological decision made over eighteen weeks can be explained clearly and defended under questioning.</w:t>
+        <w:t xml:space="preserve">The project is now fully in its closing phase. All experimental work, writing, and document revisions are complete. The Galchin handover confirmed that the communication objective for the internship was met - a non-technical stakeholder found the tool genuinely useful without requiring a technical explanation. The remaining focus is defence preparation: ensuring every methodological decision made over nineteen weeks can be explained clearly and defended under questioning.</w:t>
       </w:r>
     </w:p>
     <w:bookmarkEnd w:id="34"/>

</xml_diff>